<commit_message>
Update obesity modelling report
</commit_message>
<xml_diff>
--- a/lab1/Rapport TP.docx
+++ b/lab1/Rapport TP.docx
@@ -192,6 +192,56 @@
                 <w:szCs w:val="24"/>
               </w:rPr>
               <w:t xml:space="preserve"> September 2026</w:t>
+            </w:r>
+          </w:p>
+        </w:tc>
+      </w:tr>
+      <w:tr>
+        <w:trPr>
+          <w:jc w:val="center"/>
+        </w:trPr>
+        <w:tc>
+          <w:tcPr>
+            <w:tcW w:w="4816" w:type="dxa"/>
+            <w:shd w:val="clear" w:color="auto" w:fill="EAF1F5"/>
+            <w:vAlign w:val="center"/>
+          </w:tcPr>
+          <w:p>
+            <w:pPr>
+              <w:spacing w:line="360" w:lineRule="auto"/>
+              <w:jc w:val="both"/>
+              <w:rPr>
+                <w:rFonts w:ascii="Times New Roman" w:hAnsi="Times New Roman" w:cs="Times New Roman"/>
+                <w:b/>
+                <w:sz w:val="24"/>
+                <w:szCs w:val="24"/>
+              </w:rPr>
+            </w:pPr>
+            <w:r>
+              <w:rPr>
+                <w:b/>
+              </w:rPr>
+              <w:t>Course</w:t>
+            </w:r>
+          </w:p>
+        </w:tc>
+        <w:tc>
+          <w:tcPr>
+            <w:tcW w:w="4816" w:type="dxa"/>
+            <w:vAlign w:val="center"/>
+          </w:tcPr>
+          <w:p>
+            <w:pPr>
+              <w:spacing w:line="360" w:lineRule="auto"/>
+              <w:jc w:val="both"/>
+              <w:rPr>
+                <w:rFonts w:ascii="Times New Roman" w:hAnsi="Times New Roman" w:cs="Times New Roman"/>
+                <w:sz w:val="24"/>
+                <w:szCs w:val="24"/>
+              </w:rPr>
+            </w:pPr>
+            <w:r>
+              <w:t>M2-INASYS</w:t>
             </w:r>
           </w:p>
         </w:tc>
@@ -3399,7 +3449,6 @@
           <w:sz w:val="24"/>
           <w:szCs w:val="24"/>
         </w:rPr>
-        <w:lastRenderedPageBreak/>
         <w:t xml:space="preserve">4. Results </w:t>
       </w:r>
       <w:r>
@@ -3498,6 +3547,7 @@
                 <w:sz w:val="24"/>
                 <w:szCs w:val="24"/>
               </w:rPr>
+              <w:lastRenderedPageBreak/>
               <w:t>Metric</w:t>
             </w:r>
           </w:p>
@@ -5051,16 +5101,7 @@
           <w:sz w:val="24"/>
           <w:szCs w:val="24"/>
         </w:rPr>
-        <w:t xml:space="preserve">BMI was the only feature with non-zero importance in Model 1. Both Model 1 and Model 2 produced the same visible tree structure. The root split was BMI ≤ 24.975, followed by BMI ≤ </w:t>
-      </w:r>
-      <w:r>
-        <w:rPr>
-          <w:rFonts w:ascii="Times New Roman" w:hAnsi="Times New Roman" w:cs="Times New Roman"/>
-          <w:sz w:val="24"/>
-          <w:szCs w:val="24"/>
-        </w:rPr>
-        <w:lastRenderedPageBreak/>
-        <w:t>18.501 on the lower branch and BMI ≤ 29.995 on the upper branch. The terminal classes were Underweight, Normal weight, Overweight, and Obese.</w:t>
+        <w:t>BMI was the only feature with non-zero importance in Model 1. Both Model 1 and Model 2 produced the same visible tree structure. The root split was BMI ≤ 24.975, followed by BMI ≤ 18.501 on the lower branch and BMI ≤ 29.995 on the upper branch. The terminal classes were Underweight, Normal weight, Overweight, and Obese.</w:t>
       </w:r>
     </w:p>
     <w:p>
@@ -5080,6 +5121,7 @@
           <w:sz w:val="24"/>
           <w:szCs w:val="24"/>
         </w:rPr>
+        <w:lastRenderedPageBreak/>
         <w:drawing>
           <wp:inline distT="0" distB="0" distL="0" distR="0">
             <wp:extent cx="5394960" cy="3284379"/>
@@ -7872,16 +7914,7 @@
           <w:sz w:val="24"/>
           <w:szCs w:val="24"/>
         </w:rPr>
-        <w:t xml:space="preserve">The comparison also highlights an important distinction between implementation and interpretation. A model can be perfectly reproducible and can achieve perfect scores on a supplied test set while </w:t>
-      </w:r>
-      <w:r>
-        <w:rPr>
-          <w:rFonts w:ascii="Times New Roman" w:hAnsi="Times New Roman" w:cs="Times New Roman"/>
-          <w:sz w:val="24"/>
-          <w:szCs w:val="24"/>
-        </w:rPr>
-        <w:lastRenderedPageBreak/>
-        <w:t>still requiring caution about how the outcome variable was constructed and how representative the dataset is of the population of interest.</w:t>
+        <w:t>The comparison also highlights an important distinction between implementation and interpretation. A model can be perfectly reproducible and can achieve perfect scores on a supplied test set while still requiring caution about how the outcome variable was constructed and how representative the dataset is of the population of interest.</w:t>
       </w:r>
     </w:p>
     <w:p>
@@ -7901,6 +7934,7 @@
           <w:sz w:val="24"/>
           <w:szCs w:val="24"/>
         </w:rPr>
+        <w:lastRenderedPageBreak/>
         <w:t>9. Limitations</w:t>
       </w:r>
     </w:p>
@@ -8078,16 +8112,7 @@
           <w:sz w:val="24"/>
           <w:szCs w:val="24"/>
         </w:rPr>
-        <w:t xml:space="preserve">In Section 2, ID3 was reconstructed from scratch using entropy and Information Gain. Weight and BMI tied for the highest Information Gain, and Weight was selected first because of the order of the feature list. The resulting tree had depth 1 and two pure leaves. In Section 3, C4.5 was implemented </w:t>
-      </w:r>
-      <w:r>
-        <w:rPr>
-          <w:rFonts w:ascii="Times New Roman" w:hAnsi="Times New Roman" w:cs="Times New Roman"/>
-          <w:sz w:val="24"/>
-          <w:szCs w:val="24"/>
-        </w:rPr>
-        <w:lastRenderedPageBreak/>
-        <w:t>using Split Information and Gain Ratio. Weight and BMI again tied at a Gain Ratio of 1.0000, producing the same tree as ID3.</w:t>
+        <w:t>In Section 2, ID3 was reconstructed from scratch using entropy and Information Gain. Weight and BMI tied for the highest Information Gain, and Weight was selected first because of the order of the feature list. The resulting tree had depth 1 and two pure leaves. In Section 3, C4.5 was implemented using Split Information and Gain Ratio. Weight and BMI again tied at a Gain Ratio of 1.0000, producing the same tree as ID3.</w:t>
       </w:r>
     </w:p>
     <w:p>
@@ -8106,7 +8131,16 @@
           <w:sz w:val="24"/>
           <w:szCs w:val="24"/>
         </w:rPr>
-        <w:t>The central analytical conclusion is therefore twofold: the different decision-tree criteria agree on this supplied data because the dominant predictors generate extremely pure splits, and the apparent predictive perfection of the multiclass models must be interpreted in the context of the dataset construction. In particular, the strong dependence on BMI means that understanding how ObesityCategory was defined is essential before treating the result as evidence of independent clinical prediction or broad generalization.</w:t>
+        <w:t xml:space="preserve">The central analytical conclusion is therefore twofold: the different decision-tree criteria agree on this supplied data because the dominant predictors generate extremely pure splits, and the apparent </w:t>
+      </w:r>
+      <w:r>
+        <w:rPr>
+          <w:rFonts w:ascii="Times New Roman" w:hAnsi="Times New Roman" w:cs="Times New Roman"/>
+          <w:sz w:val="24"/>
+          <w:szCs w:val="24"/>
+        </w:rPr>
+        <w:lastRenderedPageBreak/>
+        <w:t>predictive perfection of the multiclass models must be interpreted in the context of the dataset construction. In particular, the strong dependence on BMI means that understanding how ObesityCategory was defined is essential before treating the result as evidence of independent clinical prediction or broad generalization.</w:t>
       </w:r>
     </w:p>
     <w:p>
@@ -9257,7 +9291,6 @@
   <w:style w:type="character" w:default="1" w:styleId="Policepardfaut">
     <w:name w:val="Default Paragraph Font"/>
     <w:uiPriority w:val="1"/>
-    <w:semiHidden/>
     <w:unhideWhenUsed/>
   </w:style>
   <w:style w:type="table" w:default="1" w:styleId="TableauNormal">

</xml_diff>